<commit_message>
Polish lab 6 report wording and remove run date
</commit_message>
<xml_diff>
--- a/lab6/Отчёт_Лабораторная_6.docx
+++ b/lab6/Отчёт_Лабораторная_6.docx
@@ -2691,7 +2691,7 @@
           <w:color w:val="000000"/>
           <w:sz w:val="24"/>
         </w:rPr>
-        <w:t>VU — число виртуальных пользователей. Дата измерений — 16 октября 2026 года. Агрегированная статистика включает создание и удаление Redfish-сессий. Процентили взяты из распределения Locust с его округлением; процентили разных маршрутов не усреднялись.</w:t>
+        <w:t>VU — число виртуальных пользователей. Агрегированная статистика включает создание и удаление Redfish-сессий. Процентили взяты из распределения Locust с его округлением; процентили разных маршрутов не усреднялись.</w:t>
       </w:r>
     </w:p>
     <w:p>
@@ -2832,7 +2832,7 @@
           <w:color w:val="000000"/>
           <w:sz w:val="28"/>
         </w:rPr>
-        <w:t>Испытание охватывает короткие прогоны с разгоном, без отдельного длительного прогрева. Точный предел производительности и длительная устойчивость не установлены. Результаты QEMU нельзя напрямую переносить на физический BMC. Для уточнения границы требуется отдельный согласованный эксперимент с большей нагрузкой.</w:t>
+        <w:t>Испытание охватывает короткие прогоны с разгоном, без отдельного длительного прогрева. Точный предел производительности и длительная устойчивость не установлены. Результаты QEMU нельзя напрямую переносить на физический BMC. Для уточнения предела производительности требуется более длительное испытание с большим числом пользователей.</w:t>
       </w:r>
     </w:p>
     <w:p>

</xml_diff>